<commit_message>
docs: replace British English spellings with American English in all docx files
400 replacements across 21 files. Key changes:
- anonymisation→anonymization, personalisation→personalization
- mould→mold, moulded→molded, programme→program
- colour→color, centre→center, metre→meter
- defence→defense, licence→license, catalogue→catalog
- modelling→modeling, labelling→labeling, signalling→signaling
- All -isation/-ised/-ise suffixes → -ization/-ized/-ize
</commit_message>
<xml_diff>
--- a/docs/neuropulse_additional_modalities_superseded.docx
+++ b/docs/neuropulse_additional_modalities_superseded.docx
@@ -316,7 +316,7 @@
         <w:rPr>
           <w:sz w:val="18"/>
         </w:rPr>
-        <w:t>1064nm LED arrays are commercially available but less efficient than 810nm. Alternatively, 1064nm diode lasers (similar to 1170nm T2 hardware). A third LED wavelength on existing FPC strips would require new FPC layout and zone module mould revision. Significant BOM and tooling cost.</w:t>
+        <w:t>1064nm LED arrays are commercially available but less efficient than 810nm. Alternatively, 1064nm diode lasers (similar to 1170nm T2 hardware). A third LED wavelength on existing FPC strips would require new FPC layout and zone module mold revision. Significant BOM and tooling cost.</w:t>
       </w:r>
     </w:p>
     <w:p>
@@ -757,10 +757,10 @@
         <w:rPr>
           <w:sz w:val="18"/>
         </w:rPr>
-        <w:t>STRONG (clinical context): Jog's HD-tDCS personalised RCT (n=71) used individual MRI to target left DLPFC precisely based on each patient's functional connectivity. This produced significant effects that standard F3-positioned tDCS (fixed position) did not reliably achieve in other trials. BRIGhTMIND (Nature Medicine 2024, n=255 TRD) showed connectivity-guided iTBS was superior to standard F3 targeting.</w:t>
+        <w:t>STRONG (clinical context): Jog's HD-tDCS personalized RCT (n=71) used individual MRI to target left DLPFC precisely based on each patient's functional connectivity. This produced significant effects that standard F3-positioned tDCS (fixed position) did not reliably achieve in other trials. BRIGhTMIND (Nature Medicine 2024, n=255 TRD) showed connectivity-guided iTBS was superior to standard F3 targeting.</w:t>
         <w:br/>
         <w:br/>
-        <w:t>The implication: NeuroPulse's current tDCS delivers fixed electrode positions. MRI-personalised targeting would require either (a) integrating with the user's existing MRI data, or (b) using EEG-derived source localisation (sLORETA, already in T2 stack) as a surrogate for MRI targeting.</w:t>
+        <w:t>The implication: NeuroPulse's current tDCS delivers fixed electrode positions. MRI-personalized targeting would require either (a) integrating with the user's existing MRI data, or (b) using EEG-derived source localization (sLORETA, already in T2 stack) as a surrogate for MRI targeting.</w:t>
       </w:r>
     </w:p>
     <w:p>
@@ -781,7 +781,7 @@
         <w:t>Option A (MRI integration): No new hardware; app accepts MRI DICOM data and computes optimal electrode placement (software only, but requires MRI). Not consumer-feasible for most T1 users.</w:t>
         <w:br/>
         <w:br/>
-        <w:t>Option B (sLORETA-guided, T2): T2 already includes sLORETA source imaging. Personalised electrode placement guidance based on sLORETA source maps is achievable within T2 platform (software only).</w:t>
+        <w:t>Option B (sLORETA-guided, T2): T2 already includes sLORETA source imaging. Personalized electrode placement guidance based on sLORETA source maps is achievable within T2 platform (software only).</w:t>
         <w:br/>
         <w:br/>
         <w:t>Option C (cloud AI): App analyses session EEG and recommends electrode placement adjustments based on fleet response data. No additional hardware.</w:t>
@@ -838,7 +838,7 @@
         <w:rPr>
           <w:sz w:val="18"/>
         </w:rPr>
-        <w:t>Include sLORETA-derived tDCS placement guidance in T2 app specification. Engage Jog (UCLA) for T2 clinical collaboration on personalised HD-tDCS protocol.</w:t>
+        <w:t>Include sLORETA-derived tDCS placement guidance in T2 app specification. Engage Jog (UCLA) for T2 clinical collaboration on personalized HD-tDCS protocol.</w:t>
       </w:r>
     </w:p>
     <w:p/>
@@ -1224,7 +1224,7 @@
         <w:rPr>
           <w:sz w:val="18"/>
         </w:rPr>
-        <w:t>40Hz square-wave drive via DRV2605L open-loop; session synchronised with audio/visual 40Hz channels via hub firmware clock; amplitude ramp firmware-controlled.</w:t>
+        <w:t>40Hz square-wave drive via DRV2605L open-loop; session synchronized with audio/visual 40Hz channels via hub firmware clock; amplitude ramp firmware-controlled.</w:t>
       </w:r>
     </w:p>
     <w:p>
@@ -1242,7 +1242,7 @@
         <w:rPr>
           <w:sz w:val="18"/>
         </w:rPr>
-        <w:t>Provision temporal wing anchor boss in first-cut tooling (zero cost). Commission DRV2605L + LRA characterisation bench test. Finalise pad design post-HOPE results. Engage Tsai SAB for protocol alignment.</w:t>
+        <w:t>Provision temporal wing anchor boss in first-cut tooling (zero cost). Commission DRV2605L + LRA characterization bench test. Finalise pad design post-HOPE results. Engage Tsai SAB for protocol alignment.</w:t>
       </w:r>
     </w:p>
     <w:p/>
@@ -1366,7 +1366,7 @@
         <w:rPr>
           <w:sz w:val="18"/>
         </w:rPr>
-        <w:t>watchOS Core Haptics delivers 40Hz pattern synchronised to hub session clock. Adds wrist somatosensory channel alongside mastoid LRA pad. Not standalone therapeutic — complement only. App displays: 'For best results, use with NeuroPulse vibrotactile accessory.' Note: Apple Watch haptic precision is uncharacterised for therapeutic use; this channel adds incremental sensory input, not clinical-grade stimulation.</w:t>
+        <w:t>watchOS Core Haptics delivers 40Hz pattern synchronized to hub session clock. Adds wrist somatosensory channel alongside mastoid LRA pad. Not standalone therapeutic — complement only. App displays: 'For best results, use with NeuroPulse vibrotactile accessory.' Note: Apple Watch haptic precision is uncharacterised for therapeutic use; this channel adds incremental sensory input, not clinical-grade stimulation.</w:t>
       </w:r>
     </w:p>
     <w:p>
@@ -1384,7 +1384,7 @@
         <w:rPr>
           <w:sz w:val="18"/>
         </w:rPr>
-        <w:t>Watch app plays binaural beats / isochronic tones / HRV breathing pacer audio through AirPods or earphones paired to Watch, synchronised to hub session. Useful when: (a) bone conduction reserved for breathing cue while earphones handle binaural beats; (b) user is away from hub speaker range; (c) user prefers AirPods over headset audio for a session.</w:t>
+        <w:t>Watch app plays binaural beats / isochronic tones / HRV breathing pacer audio through AirPods or earphones paired to Watch, synchronized to hub session. Useful when: (a) bone conduction reserved for breathing cue while earphones handle binaural beats; (b) user is away from hub speaker range; (c) user prefers AirPods over headset audio for a session.</w:t>
       </w:r>
     </w:p>
     <w:p>
@@ -1402,7 +1402,7 @@
         <w:rPr>
           <w:sz w:val="18"/>
         </w:rPr>
-        <w:t>Watch display shows: 40Hz visual flicker (reduced brightness, GENUS-compatible — brightness characterisation needed to confirm ≥100 nits at 40Hz); or EMDR left/right indicator arrow synchronised to goggle session; or session status + protocol name; or HRV biofeedback breathing ring (complementary to phone app display for wrist-glance UX).</w:t>
+        <w:t>Watch display shows: 40Hz visual flicker (reduced brightness, GENUS-compatible — brightness characterization needed to confirm ≥100 nits at 40Hz); or EMDR left/right indicator arrow synchronized to goggle session; or session status + protocol name; or HRV biofeedback breathing ring (complementary to phone app display for wrist-glance UX).</w:t>
       </w:r>
     </w:p>
     <w:p>
@@ -1474,7 +1474,7 @@
         <w:rPr>
           <w:sz w:val="18"/>
         </w:rPr>
-        <w:t>Add watchOS app to iOS app development roadmap (Year 1 post-launch). Prioritise: (1) session status + HRV breathing ring; (2) audio sync; (3) haptic sync; (4) 40Hz visual flicker (requires screen characterisation first).</w:t>
+        <w:t>Add watchOS app to iOS app development roadmap (Year 1 post-launch). Prioritise: (1) session status + HRV breathing ring; (2) audio sync; (3) haptic sync; (4) 40Hz visual flicker (requires screen characterization first).</w:t>
       </w:r>
     </w:p>
     <w:p/>

</xml_diff>